<commit_message>
docs: silent printing on the till, findings eighteen to twenty
</commit_message>
<xml_diff>
--- a/docs/Etham-Station-Setup.docx
+++ b/docs/Etham-Station-Setup.docx
@@ -1127,7 +1127,169 @@
       </w:r>
     </w:p>
     <w:bookmarkEnd w:id="24"/>
-    <w:bookmarkStart w:id="25" w:name="add-another-device-or-change-a-password"/>
+    <w:bookmarkStart w:id="25" w:name="b.-silent-receipt-printing-on-the-till"/>
+    <w:p>
+      <w:pPr>
+        <w:pStyle w:val="Heading1"/>
+      </w:pPr>
+      <w:r>
+        <w:t xml:space="preserve">3b. Silent receipt printing on the till</w:t>
+      </w:r>
+    </w:p>
+    <w:p>
+      <w:pPr>
+        <w:pStyle w:val="FirstParagraph"/>
+      </w:pPr>
+      <w:r>
+        <w:t xml:space="preserve">Paying a check prints the receipt from the till’s own tab: the print dialog</w:t>
+      </w:r>
+      <w:r>
+        <w:t xml:space="preserve"> </w:t>
+      </w:r>
+      <w:r>
+        <w:t xml:space="preserve">opens at once, already pointed at the default printer. To skip the dialog</w:t>
+      </w:r>
+      <w:r>
+        <w:t xml:space="preserve"> </w:t>
+      </w:r>
+      <w:r>
+        <w:t xml:space="preserve">entirely (paper comes out the moment the cashier confirms):</w:t>
+      </w:r>
+    </w:p>
+    <w:p>
+      <w:pPr>
+        <w:pStyle w:val="Compact"/>
+        <w:numPr>
+          <w:ilvl w:val="0"/>
+          <w:numId w:val="1005"/>
+        </w:numPr>
+      </w:pPr>
+      <w:r>
+        <w:t xml:space="preserve">Set the Posiflex as the</w:t>
+      </w:r>
+      <w:r>
+        <w:t xml:space="preserve"> </w:t>
+      </w:r>
+      <w:r>
+        <w:rPr>
+          <w:b/>
+          <w:bCs/>
+        </w:rPr>
+        <w:t xml:space="preserve">default printer</w:t>
+      </w:r>
+      <w:r>
+        <w:t xml:space="preserve"> </w:t>
+      </w:r>
+      <w:r>
+        <w:t xml:space="preserve">in Windows, paper size 80 mm.</w:t>
+      </w:r>
+    </w:p>
+    <w:p>
+      <w:pPr>
+        <w:pStyle w:val="Compact"/>
+        <w:numPr>
+          <w:ilvl w:val="0"/>
+          <w:numId w:val="1005"/>
+        </w:numPr>
+      </w:pPr>
+      <w:r>
+        <w:t xml:space="preserve">Start Chrome for the till with the flag</w:t>
+      </w:r>
+      <w:r>
+        <w:t xml:space="preserve"> </w:t>
+      </w:r>
+      <w:r>
+        <w:rPr>
+          <w:rStyle w:val="VerbatimChar"/>
+        </w:rPr>
+        <w:t xml:space="preserve">--kiosk-printing</w:t>
+      </w:r>
+      <w:r>
+        <w:t xml:space="preserve"> </w:t>
+      </w:r>
+      <w:r>
+        <w:t xml:space="preserve">— right-click</w:t>
+      </w:r>
+      <w:r>
+        <w:t xml:space="preserve"> </w:t>
+      </w:r>
+      <w:r>
+        <w:t xml:space="preserve">the Chrome shortcut → Properties → add</w:t>
+      </w:r>
+      <w:r>
+        <w:t xml:space="preserve"> </w:t>
+      </w:r>
+      <w:r>
+        <w:rPr>
+          <w:rStyle w:val="VerbatimChar"/>
+        </w:rPr>
+        <w:t xml:space="preserve">--kiosk-printing</w:t>
+      </w:r>
+      <w:r>
+        <w:t xml:space="preserve"> </w:t>
+      </w:r>
+      <w:r>
+        <w:t xml:space="preserve">at the end of</w:t>
+      </w:r>
+      <w:r>
+        <w:t xml:space="preserve"> </w:t>
+      </w:r>
+      <w:r>
+        <w:rPr>
+          <w:i/>
+          <w:iCs/>
+        </w:rPr>
+        <w:t xml:space="preserve">Target</w:t>
+      </w:r>
+      <w:r>
+        <w:t xml:space="preserve">. Use that shortcut for the till.</w:t>
+      </w:r>
+    </w:p>
+    <w:p>
+      <w:pPr>
+        <w:pStyle w:val="Compact"/>
+        <w:numPr>
+          <w:ilvl w:val="0"/>
+          <w:numId w:val="1005"/>
+        </w:numPr>
+      </w:pPr>
+      <w:r>
+        <w:t xml:space="preserve">Print one receipt to confirm the dialog no longer appears.</w:t>
+      </w:r>
+    </w:p>
+    <w:p>
+      <w:pPr>
+        <w:pStyle w:val="FirstParagraph"/>
+      </w:pPr>
+      <w:r>
+        <w:t xml:space="preserve">Without the flag the dialog still appears instantly and one tap on</w:t>
+      </w:r>
+      <w:r>
+        <w:t xml:space="preserve"> </w:t>
+      </w:r>
+      <w:r>
+        <w:rPr>
+          <w:b/>
+          <w:bCs/>
+        </w:rPr>
+        <w:t xml:space="preserve">Print</w:t>
+      </w:r>
+      <w:r>
+        <w:t xml:space="preserve"> </w:t>
+      </w:r>
+      <w:r>
+        <w:t xml:space="preserve">sends it — no second tab either way.</w:t>
+      </w:r>
+    </w:p>
+    <w:p>
+      <w:r>
+        <w:pict>
+          <v:rect style="width:0;height:1.5pt" o:hralign="center" o:hrstd="t" o:hr="t"/>
+        </w:pict>
+      </w:r>
+    </w:p>
+    <w:bookmarkEnd w:id="25"/>
+    <w:bookmarkStart w:id="26" w:name="add-another-device-or-change-a-password"/>
     <w:p>
       <w:pPr>
         <w:pStyle w:val="Heading1"/>
@@ -1630,8 +1792,8 @@
         </w:pict>
       </w:r>
     </w:p>
-    <w:bookmarkEnd w:id="25"/>
-    <w:bookmarkStart w:id="26" w:name="confirming-it-worked"/>
+    <w:bookmarkEnd w:id="26"/>
+    <w:bookmarkStart w:id="27" w:name="confirming-it-worked"/>
     <w:p>
       <w:pPr>
         <w:pStyle w:val="Heading1"/>
@@ -1914,8 +2076,8 @@
         </w:pict>
       </w:r>
     </w:p>
-    <w:bookmarkEnd w:id="26"/>
-    <w:bookmarkStart w:id="36" w:name="proof-from-the-live-system"/>
+    <w:bookmarkEnd w:id="27"/>
+    <w:bookmarkStart w:id="37" w:name="proof-from-the-live-system"/>
     <w:p>
       <w:pPr>
         <w:pStyle w:val="Heading1"/>
@@ -2013,18 +2175,18 @@
           <wp:inline>
             <wp:extent cx="5334000" cy="3167062"/>
             <wp:effectExtent b="0" l="0" r="0" t="0"/>
-            <wp:docPr descr="Waiter station" title="" id="28" name="Picture"/>
+            <wp:docPr descr="Waiter station" title="" id="29" name="Picture"/>
             <a:graphic>
               <a:graphicData uri="http://schemas.openxmlformats.org/drawingml/2006/picture">
                 <pic:pic>
                   <pic:nvPicPr>
-                    <pic:cNvPr descr="images/stations/waiter-floor.png" id="29" name="Picture"/>
+                    <pic:cNvPr descr="images/stations/waiter-floor.png" id="30" name="Picture"/>
                     <pic:cNvPicPr>
                       <a:picLocks noChangeArrowheads="1" noChangeAspect="1"/>
                     </pic:cNvPicPr>
                   </pic:nvPicPr>
                   <pic:blipFill>
-                    <a:blip r:embed="rId27"/>
+                    <a:blip r:embed="rId28"/>
                     <a:stretch>
                       <a:fillRect/>
                     </a:stretch>
@@ -2086,18 +2248,18 @@
           <wp:inline>
             <wp:extent cx="5334000" cy="3167062"/>
             <wp:effectExtent b="0" l="0" r="0" t="0"/>
-            <wp:docPr descr="Kitchen station" title="" id="31" name="Picture"/>
+            <wp:docPr descr="Kitchen station" title="" id="32" name="Picture"/>
             <a:graphic>
               <a:graphicData uri="http://schemas.openxmlformats.org/drawingml/2006/picture">
                 <pic:pic>
                   <pic:nvPicPr>
-                    <pic:cNvPr descr="images/stations/kitchen-floor.png" id="32" name="Picture"/>
+                    <pic:cNvPr descr="images/stations/kitchen-floor.png" id="33" name="Picture"/>
                     <pic:cNvPicPr>
                       <a:picLocks noChangeArrowheads="1" noChangeAspect="1"/>
                     </pic:cNvPicPr>
                   </pic:nvPicPr>
                   <pic:blipFill>
-                    <a:blip r:embed="rId30"/>
+                    <a:blip r:embed="rId31"/>
                     <a:stretch>
                       <a:fillRect/>
                     </a:stretch>
@@ -2235,18 +2397,18 @@
           <wp:inline>
             <wp:extent cx="5334000" cy="3167062"/>
             <wp:effectExtent b="0" l="0" r="0" t="0"/>
-            <wp:docPr descr="Cashier station" title="" id="34" name="Picture"/>
+            <wp:docPr descr="Cashier station" title="" id="35" name="Picture"/>
             <a:graphic>
               <a:graphicData uri="http://schemas.openxmlformats.org/drawingml/2006/picture">
                 <pic:pic>
                   <pic:nvPicPr>
-                    <pic:cNvPr descr="images/stations/cashier-floor.png" id="35" name="Picture"/>
+                    <pic:cNvPr descr="images/stations/cashier-floor.png" id="36" name="Picture"/>
                     <pic:cNvPicPr>
                       <a:picLocks noChangeArrowheads="1" noChangeAspect="1"/>
                     </pic:cNvPicPr>
                   </pic:nvPicPr>
                   <pic:blipFill>
-                    <a:blip r:embed="rId33"/>
+                    <a:blip r:embed="rId34"/>
                     <a:stretch>
                       <a:fillRect/>
                     </a:stretch>
@@ -2288,8 +2450,8 @@
         </w:pict>
       </w:r>
     </w:p>
-    <w:bookmarkEnd w:id="36"/>
-    <w:bookmarkStart w:id="37" w:name="if-a-screen-looks-wrong"/>
+    <w:bookmarkEnd w:id="37"/>
+    <w:bookmarkStart w:id="38" w:name="if-a-screen-looks-wrong"/>
     <w:p>
       <w:pPr>
         <w:pStyle w:val="Heading1"/>
@@ -2641,7 +2803,7 @@
         </w:tc>
       </w:tr>
     </w:tbl>
-    <w:bookmarkEnd w:id="37"/>
+    <w:bookmarkEnd w:id="38"/>
     <w:sectPr/>
   </w:body>
 </w:document>
@@ -2927,6 +3089,36 @@
     </w:lvlOverride>
   </w:num>
   <w:num w:numId="1004">
+    <w:abstractNumId w:val="99411"/>
+    <w:lvlOverride w:ilvl="0">
+      <w:startOverride w:val="1"/>
+    </w:lvlOverride>
+    <w:lvlOverride w:ilvl="1">
+      <w:startOverride w:val="1"/>
+    </w:lvlOverride>
+    <w:lvlOverride w:ilvl="2">
+      <w:startOverride w:val="1"/>
+    </w:lvlOverride>
+    <w:lvlOverride w:ilvl="3">
+      <w:startOverride w:val="1"/>
+    </w:lvlOverride>
+    <w:lvlOverride w:ilvl="4">
+      <w:startOverride w:val="1"/>
+    </w:lvlOverride>
+    <w:lvlOverride w:ilvl="5">
+      <w:startOverride w:val="1"/>
+    </w:lvlOverride>
+    <w:lvlOverride w:ilvl="6">
+      <w:startOverride w:val="1"/>
+    </w:lvlOverride>
+    <w:lvlOverride w:ilvl="7">
+      <w:startOverride w:val="1"/>
+    </w:lvlOverride>
+    <w:lvlOverride w:ilvl="8">
+      <w:startOverride w:val="1"/>
+    </w:lvlOverride>
+  </w:num>
+  <w:num w:numId="1005">
     <w:abstractNumId w:val="99411"/>
     <w:lvlOverride w:ilvl="0">
       <w:startOverride w:val="1"/>

</xml_diff>

<commit_message>
docs: M-Pesa by code — finding twenty-two
</commit_message>
<xml_diff>
--- a/docs/Etham-Station-Setup.docx
+++ b/docs/Etham-Station-Setup.docx
@@ -1159,6 +1159,30 @@
       </w:pPr>
       <w:r>
         <w:t xml:space="preserve">3b. Silent receipt printing on the till</w:t>
+      </w:r>
+    </w:p>
+    <w:p>
+      <w:pPr>
+        <w:pStyle w:val="BlockText"/>
+      </w:pPr>
+      <w:r>
+        <w:rPr>
+          <w:b/>
+          <w:bCs/>
+        </w:rPr>
+        <w:t xml:space="preserve">M-Pesa on the till:</w:t>
+      </w:r>
+      <w:r>
+        <w:t xml:space="preserve"> </w:t>
+      </w:r>
+      <w:r>
+        <w:t xml:space="preserve">the cashier types the customer’s 10-character confirmation</w:t>
+      </w:r>
+      <w:r>
+        <w:t xml:space="preserve"> </w:t>
+      </w:r>
+      <w:r>
+        <w:t xml:space="preserve">code under the M-Pesa amount before tapping Pay. No code, no payment.</w:t>
       </w:r>
     </w:p>
     <w:p>

</xml_diff>